<commit_message>
docs: restructure module upgrade doc as issue/solution/action/time list
Reformats Modules-net10-upgrade-effort.docx into a bullet list where each
item states the .NET 10 issue, the solution, what the developer does, and
the time it takes. Work is described as manual developer steps.

Co-Authored-By: Claude Opus 4.8 (1M context) <noreply@anthropic.com>
</commit_message>
<xml_diff>
--- a/docs/Modules-net10-upgrade-effort.docx
+++ b/docs/Modules-net10-upgrade-effort.docx
@@ -24,7 +24,7 @@
           <w:color w:val="555566"/>
           <w:sz w:val="24"/>
         </w:rPr>
-        <w:t>Key challenges and the developer effort each one takes.</w:t>
+        <w:t>The issues, one by one: what the problem is, how it is solved, what a developer has to do, and how long it takes.</w:t>
       </w:r>
     </w:p>
     <w:p>
@@ -35,7 +35,7 @@
         <w:rPr>
           <w:color w:val="1F4E79"/>
         </w:rPr>
-        <w:t>The one rule that shapes everything</w:t>
+        <w:t>Before the list — the one rule</w:t>
       </w:r>
     </w:p>
     <w:p>
@@ -48,42 +48,40 @@
           <w:i w:val="0"/>
           <w:sz w:val="22"/>
         </w:rPr>
-        <w:t>The host loads every module into its own process. Host and modules therefore share the exact same loaded libraries, so two things are non-negotiable:</w:t>
+        <w:t>The host loads every module into its own process, so the host and all its modules share the same loaded libraries. Two things follow, and they explain most of the issues below:</w:t>
       </w:r>
     </w:p>
     <w:p>
       <w:pPr>
         <w:pStyle w:val="ListBullet"/>
-        <w:spacing w:after="120"/>
       </w:pPr>
       <w:r>
         <w:rPr>
           <w:b/>
         </w:rPr>
-        <w:t>Same versions everywhere.</w:t>
+        <w:t xml:space="preserve">Same versions everywhere. </w:t>
       </w:r>
       <w:r>
-        <w:t xml:space="preserve"> Every shared package (Entity Framework, logging, JSON) must be the same version in the modules as in the host. A mismatch builds fine, then crashes at runtime.</w:t>
+        <w:t>A module must use the exact same shared-library versions as the host, or it loads and then crashes.</w:t>
       </w:r>
     </w:p>
     <w:p>
       <w:pPr>
         <w:pStyle w:val="ListBullet"/>
-        <w:spacing w:after="120"/>
       </w:pPr>
       <w:r>
         <w:rPr>
           <w:b/>
         </w:rPr>
-        <w:t>Everyone moves together.</w:t>
+        <w:t xml:space="preserve">Everyone moves together. </w:t>
       </w:r>
       <w:r>
-        <w:t xml:space="preserve"> The host and every module switch to .NET 10 in one deployment / restart window. A single module left on the old version builds fine, loads, and then takes the service down.</w:t>
+        <w:t>The host and every module go to .NET 10 in one deployment. A module left behind builds fine, then takes the service down at runtime.</w:t>
       </w:r>
     </w:p>
     <w:p>
       <w:pPr>
-        <w:spacing w:after="120"/>
+        <w:spacing w:after="200"/>
       </w:pPr>
       <w:r>
         <w:rPr>
@@ -91,50 +89,7 @@
           <w:i w:val="0"/>
           <w:sz w:val="22"/>
         </w:rPr>
-        <w:t>There are two kinds of module and the effort is very different, so they are split below. Subscribers do data mapping (they used AutoMapper); filters are lighter and usually do not.</w:t>
-      </w:r>
-    </w:p>
-    <w:p>
-      <w:pPr>
-        <w:spacing w:after="40"/>
-      </w:pPr>
-      <w:r>
-        <w:rPr>
-          <w:b/>
-          <w:i w:val="0"/>
-          <w:sz w:val="22"/>
-        </w:rPr>
-        <w:t>How to read the effort numbers:</w:t>
-      </w:r>
-    </w:p>
-    <w:p>
-      <w:pPr>
-        <w:pStyle w:val="ListBullet"/>
-        <w:spacing w:after="120"/>
-      </w:pPr>
-      <w:r>
-        <w:rPr>
-          <w:b/>
-        </w:rPr>
-        <w:t>Per module,</w:t>
-      </w:r>
-      <w:r>
-        <w:t xml:space="preserve"> and they assume the migration script has already done the mechanical part (retarget + package versions + reference paths).</w:t>
-      </w:r>
-    </w:p>
-    <w:p>
-      <w:pPr>
-        <w:pStyle w:val="ListBullet"/>
-        <w:spacing w:after="120"/>
-      </w:pPr>
-      <w:r>
-        <w:rPr>
-          <w:b/>
-        </w:rPr>
-        <w:t>For a developer who has already done one module.</w:t>
-      </w:r>
-      <w:r>
-        <w:t xml:space="preserve"> The first module of each type takes longer because you work out the pattern once; after that it is repetition.</w:t>
+        <w:t>There are two kinds of module. Subscribers do data mapping and carry the most work; filters are lighter. They are listed separately. Times are per module, for a developer who has already done one (the first of each type takes longer).</w:t>
       </w:r>
     </w:p>
     <w:p>
@@ -155,239 +110,520 @@
       <w:r>
         <w:rPr>
           <w:b w:val="0"/>
-          <w:i w:val="0"/>
+          <w:i/>
+          <w:color w:val="555566"/>
           <w:sz w:val="22"/>
         </w:rPr>
-        <w:t>These pull data, map it onto database records, and save it. The mapping part is the real work.</w:t>
+        <w:t>These pull data, map it onto database records, and save it.</w:t>
       </w:r>
     </w:p>
     <w:p>
       <w:pPr>
         <w:pStyle w:val="ListBullet"/>
-        <w:spacing w:after="120"/>
+        <w:spacing w:after="60"/>
+      </w:pPr>
+      <w:r>
+        <w:rPr>
+          <w:b/>
+          <w:color w:val="1F4E79"/>
+        </w:rPr>
+        <w:t xml:space="preserve">Issue: </w:t>
+      </w:r>
+      <w:r>
+        <w:t>The module targets .NET 6, but it must run on .NET 10 to load into the upgraded host.</w:t>
+      </w:r>
+    </w:p>
+    <w:p>
+      <w:pPr>
+        <w:pStyle w:val="ListBullet2"/>
+        <w:spacing w:after="60"/>
       </w:pPr>
       <w:r>
         <w:rPr>
           <w:b/>
         </w:rPr>
-        <w:t>Retarget to .NET 10 and match the host package versions.</w:t>
+        <w:t xml:space="preserve">Solution: </w:t>
       </w:r>
       <w:r>
-        <w:t xml:space="preserve"> Done by the script, which copies the versions straight from the host so they can never disagree.</w:t>
+        <w:rPr>
+          <w:i w:val="0"/>
+        </w:rPr>
+        <w:t>Retarget the project to .NET 10.</w:t>
+      </w:r>
+    </w:p>
+    <w:p>
+      <w:pPr>
+        <w:pStyle w:val="ListBullet2"/>
+        <w:spacing w:after="60"/>
+      </w:pPr>
+      <w:r>
+        <w:rPr>
+          <w:b/>
+        </w:rPr>
+        <w:t xml:space="preserve">What the developer does: </w:t>
       </w:r>
       <w:r>
-        <w:t xml:space="preserve">  </w:t>
+        <w:rPr>
+          <w:i w:val="0"/>
+        </w:rPr>
+        <w:t>Open the subscriber’s project file and change the target framework from net6.0 to net10.0.</w:t>
       </w:r>
+    </w:p>
+    <w:p>
+      <w:pPr>
+        <w:pStyle w:val="ListBullet2"/>
+        <w:spacing w:after="160"/>
+      </w:pPr>
       <w:r>
         <w:rPr>
           <w:b/>
           <w:color w:val="1A7F4B"/>
         </w:rPr>
-        <w:t xml:space="preserve">Effort: </w:t>
+        <w:t xml:space="preserve">Time: </w:t>
       </w:r>
       <w:r>
         <w:rPr>
           <w:i/>
           <w:color w:val="1A7F4B"/>
         </w:rPr>
-        <w:t>~5 min to run + ~15 min to review the change.</w:t>
+        <w:t>~5 minutes.</w:t>
       </w:r>
     </w:p>
     <w:p>
       <w:pPr>
         <w:pStyle w:val="ListBullet"/>
-        <w:spacing w:after="120"/>
+        <w:spacing w:after="60"/>
+      </w:pPr>
+      <w:r>
+        <w:rPr>
+          <w:b/>
+          <w:color w:val="1F4E79"/>
+        </w:rPr>
+        <w:t xml:space="preserve">Issue: </w:t>
+      </w:r>
+      <w:r>
+        <w:t>The module’s shared library versions (Entity Framework, logging, JSON, etc.) differ from the host’s. Because host and module share one process, any mismatch makes the module load and then crash with type errors.</w:t>
+      </w:r>
+    </w:p>
+    <w:p>
+      <w:pPr>
+        <w:pStyle w:val="ListBullet2"/>
+        <w:spacing w:after="60"/>
       </w:pPr>
       <w:r>
         <w:rPr>
           <w:b/>
         </w:rPr>
-        <w:t>Fix the hard-coded paths to the host DLLs.</w:t>
+        <w:t xml:space="preserve">Solution: </w:t>
       </w:r>
       <w:r>
-        <w:t xml:space="preserve"> The old paths had "net6.0" baked in and would silently pick up last year's host build. The script makes them version-neutral.</w:t>
+        <w:rPr>
+          <w:i w:val="0"/>
+        </w:rPr>
+        <w:t>Set every shared package in the module to the exact same version the host now uses.</w:t>
+      </w:r>
+    </w:p>
+    <w:p>
+      <w:pPr>
+        <w:pStyle w:val="ListBullet2"/>
+        <w:spacing w:after="60"/>
+      </w:pPr>
+      <w:r>
+        <w:rPr>
+          <w:b/>
+        </w:rPr>
+        <w:t xml:space="preserve">What the developer does: </w:t>
       </w:r>
       <w:r>
-        <w:t xml:space="preserve">  </w:t>
+        <w:rPr>
+          <w:i w:val="0"/>
+        </w:rPr>
+        <w:t>Open the host’s project files, note the new package versions, and update each matching PackageReference in the module to match them one by one.</w:t>
       </w:r>
+    </w:p>
+    <w:p>
+      <w:pPr>
+        <w:pStyle w:val="ListBullet2"/>
+        <w:spacing w:after="160"/>
+      </w:pPr>
       <w:r>
         <w:rPr>
           <w:b/>
           <w:color w:val="1A7F4B"/>
         </w:rPr>
-        <w:t xml:space="preserve">Effort: </w:t>
+        <w:t xml:space="preserve">Time: </w:t>
       </w:r>
       <w:r>
         <w:rPr>
           <w:i/>
           <w:color w:val="1A7F4B"/>
         </w:rPr>
-        <w:t>Included in the step above (scripted).</w:t>
+        <w:t>~15–20 minutes.</w:t>
       </w:r>
     </w:p>
     <w:p>
       <w:pPr>
         <w:pStyle w:val="ListBullet"/>
-        <w:spacing w:after="120"/>
+        <w:spacing w:after="60"/>
+      </w:pPr>
+      <w:r>
+        <w:rPr>
+          <w:b/>
+          <w:color w:val="1F4E79"/>
+        </w:rPr>
+        <w:t xml:space="preserve">Issue: </w:t>
+      </w:r>
+      <w:r>
+        <w:t>The references to the host’s DLLs have the framework folder baked into the path (…\net6.0\…). After retargeting, the module would silently keep pointing at last year’s .NET 6 host build.</w:t>
+      </w:r>
+    </w:p>
+    <w:p>
+      <w:pPr>
+        <w:pStyle w:val="ListBullet2"/>
+        <w:spacing w:after="60"/>
       </w:pPr>
       <w:r>
         <w:rPr>
           <w:b/>
         </w:rPr>
-        <w:t>Replace AutoMapper with compile-time mapping. THIS IS THE MAIN JOB.</w:t>
+        <w:t xml:space="preserve">Solution: </w:t>
       </w:r>
       <w:r>
-        <w:t xml:space="preserve"> AutoMapper builds fine but crashes the first time it maps anything on .NET 10. Each mapping rule has to be re-written as a generated (Mapperly) mapping. It is mechanical once you have seen one, but every "ignore this field" rule must be reproduced exactly — the compiler now checks you, which is a good thing.</w:t>
+        <w:rPr>
+          <w:i w:val="0"/>
+        </w:rPr>
+        <w:t>Make those reference paths framework-neutral so they always follow whatever framework is being built.</w:t>
+      </w:r>
+    </w:p>
+    <w:p>
+      <w:pPr>
+        <w:pStyle w:val="ListBullet2"/>
+        <w:spacing w:after="60"/>
+      </w:pPr>
+      <w:r>
+        <w:rPr>
+          <w:b/>
+        </w:rPr>
+        <w:t xml:space="preserve">What the developer does: </w:t>
       </w:r>
       <w:r>
-        <w:t xml:space="preserve">  </w:t>
+        <w:rPr>
+          <w:i w:val="0"/>
+        </w:rPr>
+        <w:t>In the project file, replace the "net6.0" part of each host-DLL reference path with the build variables $(Configuration)\$(TargetFramework).</w:t>
       </w:r>
+    </w:p>
+    <w:p>
+      <w:pPr>
+        <w:pStyle w:val="ListBullet2"/>
+        <w:spacing w:after="160"/>
+      </w:pPr>
       <w:r>
         <w:rPr>
           <w:b/>
           <w:color w:val="1A7F4B"/>
         </w:rPr>
-        <w:t xml:space="preserve">Effort: </w:t>
+        <w:t xml:space="preserve">Time: </w:t>
       </w:r>
       <w:r>
         <w:rPr>
           <w:i/>
           <w:color w:val="1A7F4B"/>
         </w:rPr>
-        <w:t>0.5-2 hours per subscriber. The FIRST subscriber ~1 day to set the pattern.</w:t>
+        <w:t>~10 minutes.</w:t>
       </w:r>
     </w:p>
     <w:p>
       <w:pPr>
         <w:pStyle w:val="ListBullet"/>
-        <w:spacing w:after="120"/>
+        <w:spacing w:after="60"/>
+      </w:pPr>
+      <w:r>
+        <w:rPr>
+          <w:b/>
+          <w:color w:val="1F4E79"/>
+        </w:rPr>
+        <w:t xml:space="preserve">Issue: </w:t>
+      </w:r>
+      <w:r>
+        <w:t>AutoMapper (used to copy incoming data onto database records) builds fine but crashes the first time it runs on .NET 10. It also has a security advisory and its fixed versions are no longer free. This is the main job.</w:t>
+      </w:r>
+    </w:p>
+    <w:p>
+      <w:pPr>
+        <w:pStyle w:val="ListBullet2"/>
+        <w:spacing w:after="60"/>
       </w:pPr>
       <w:r>
         <w:rPr>
           <w:b/>
         </w:rPr>
-        <w:t>Watch the "clone" trap.</w:t>
+        <w:t xml:space="preserve">Solution: </w:t>
       </w:r>
       <w:r>
-        <w:t xml:space="preserve"> The new mapper, asked to copy an object to the same type, hands back the SAME object instead of a copy. If a subscriber snapshots old values before an update, this silently breaks change detection (no error, wrong result). There is a known one-line fix; you just have to look for it.</w:t>
+        <w:rPr>
+          <w:i w:val="0"/>
+        </w:rPr>
+        <w:t>Replace AutoMapper with compile-time generated mapping (Mapperly).</w:t>
+      </w:r>
+    </w:p>
+    <w:p>
+      <w:pPr>
+        <w:pStyle w:val="ListBullet2"/>
+        <w:spacing w:after="60"/>
+      </w:pPr>
+      <w:r>
+        <w:rPr>
+          <w:b/>
+        </w:rPr>
+        <w:t xml:space="preserve">What the developer does: </w:t>
       </w:r>
       <w:r>
-        <w:t xml:space="preserve">  </w:t>
+        <w:rPr>
+          <w:i w:val="0"/>
+        </w:rPr>
+        <w:t>For each mapping: create a Mapperly mapper class, turn every "ignore this field" rule into a [MapperIgnoreTarget] attribute and every renamed field into a [MapProperty] attribute, register the generated copy methods, and delete the old AutoMapper configuration. The compiler now checks that nothing was missed.</w:t>
       </w:r>
+    </w:p>
+    <w:p>
+      <w:pPr>
+        <w:pStyle w:val="ListBullet2"/>
+        <w:spacing w:after="160"/>
+      </w:pPr>
       <w:r>
         <w:rPr>
           <w:b/>
           <w:color w:val="1A7F4B"/>
         </w:rPr>
-        <w:t xml:space="preserve">Effort: </w:t>
+        <w:t xml:space="preserve">Time: </w:t>
       </w:r>
       <w:r>
         <w:rPr>
           <w:i/>
           <w:color w:val="1A7F4B"/>
         </w:rPr>
-        <w:t>~15 min for a subscriber that clones records; 0 for those that don't.</w:t>
+        <w:t>0.5–2 hours per subscriber; the first one about 1 day to work out the pattern.</w:t>
       </w:r>
     </w:p>
     <w:p>
       <w:pPr>
         <w:pStyle w:val="ListBullet"/>
-        <w:spacing w:after="120"/>
+        <w:spacing w:after="60"/>
+      </w:pPr>
+      <w:r>
+        <w:rPr>
+          <w:b/>
+          <w:color w:val="1F4E79"/>
+        </w:rPr>
+        <w:t xml:space="preserve">Issue: </w:t>
+      </w:r>
+      <w:r>
+        <w:t>The "clone" trap: the new mapper, if asked to copy an object to the same type, hands back the same object instead of a real copy. If a subscriber takes a snapshot of the old values before an update, this silently breaks change detection — no error, wrong result.</w:t>
+      </w:r>
+    </w:p>
+    <w:p>
+      <w:pPr>
+        <w:pStyle w:val="ListBullet2"/>
+        <w:spacing w:after="60"/>
       </w:pPr>
       <w:r>
         <w:rPr>
           <w:b/>
         </w:rPr>
-        <w:t>Swap the mapper type at the call sites.</w:t>
+        <w:t xml:space="preserve">Solution: </w:t>
       </w:r>
       <w:r>
-        <w:t xml:space="preserve"> Change one interface name (IMapper to IObjectMapper). The actual map calls do not change.</w:t>
+        <w:rPr>
+          <w:i w:val="0"/>
+        </w:rPr>
+        <w:t>Never use a same-type map for copying; make a new object and copy the values into it.</w:t>
+      </w:r>
+    </w:p>
+    <w:p>
+      <w:pPr>
+        <w:pStyle w:val="ListBullet2"/>
+        <w:spacing w:after="60"/>
+      </w:pPr>
+      <w:r>
+        <w:rPr>
+          <w:b/>
+        </w:rPr>
+        <w:t xml:space="preserve">What the developer does: </w:t>
       </w:r>
       <w:r>
-        <w:t xml:space="preserve">  </w:t>
+        <w:rPr>
+          <w:i w:val="0"/>
+        </w:rPr>
+        <w:t>Find any clone or same-type copy in the module and replace it with the "new object, then copy into it" pattern.</w:t>
       </w:r>
+    </w:p>
+    <w:p>
+      <w:pPr>
+        <w:pStyle w:val="ListBullet2"/>
+        <w:spacing w:after="160"/>
+      </w:pPr>
       <w:r>
         <w:rPr>
           <w:b/>
           <w:color w:val="1A7F4B"/>
         </w:rPr>
-        <w:t xml:space="preserve">Effort: </w:t>
+        <w:t xml:space="preserve">Time: </w:t>
       </w:r>
       <w:r>
         <w:rPr>
           <w:i/>
           <w:color w:val="1A7F4B"/>
         </w:rPr>
-        <w:t>~10 min per subscriber.</w:t>
+        <w:t>~15 minutes for a subscriber that clones records; none for those that don’t.</w:t>
       </w:r>
     </w:p>
     <w:p>
       <w:pPr>
         <w:pStyle w:val="ListBullet"/>
-        <w:spacing w:after="120"/>
+        <w:spacing w:after="60"/>
+      </w:pPr>
+      <w:r>
+        <w:rPr>
+          <w:b/>
+          <w:color w:val="1F4E79"/>
+        </w:rPr>
+        <w:t xml:space="preserve">Issue: </w:t>
+      </w:r>
+      <w:r>
+        <w:t>The subscriber code refers to AutoMapper’s mapper type (IMapper), which no longer exists once AutoMapper is removed.</w:t>
+      </w:r>
+    </w:p>
+    <w:p>
+      <w:pPr>
+        <w:pStyle w:val="ListBullet2"/>
+        <w:spacing w:after="60"/>
       </w:pPr>
       <w:r>
         <w:rPr>
           <w:b/>
         </w:rPr>
-        <w:t>Build, deploy into the host, and confirm it loads.</w:t>
+        <w:t xml:space="preserve">Solution: </w:t>
       </w:r>
       <w:r>
-        <w:t xml:space="preserve"> A green build is not enough — start the host and see the subscriber load, because the crash only shows at runtime.</w:t>
+        <w:rPr>
+          <w:i w:val="0"/>
+        </w:rPr>
+        <w:t>Point the code at the replacement mapper interface.</w:t>
+      </w:r>
+    </w:p>
+    <w:p>
+      <w:pPr>
+        <w:pStyle w:val="ListBullet2"/>
+        <w:spacing w:after="60"/>
+      </w:pPr>
+      <w:r>
+        <w:rPr>
+          <w:b/>
+        </w:rPr>
+        <w:t xml:space="preserve">What the developer does: </w:t>
       </w:r>
       <w:r>
-        <w:t xml:space="preserve">  </w:t>
+        <w:rPr>
+          <w:i w:val="0"/>
+        </w:rPr>
+        <w:t>Change the using directive and the mapper type (IMapper to IObjectMapper) in the subscriber classes. The actual map calls stay exactly the same.</w:t>
       </w:r>
+    </w:p>
+    <w:p>
+      <w:pPr>
+        <w:pStyle w:val="ListBullet2"/>
+        <w:spacing w:after="160"/>
+      </w:pPr>
       <w:r>
         <w:rPr>
           <w:b/>
           <w:color w:val="1A7F4B"/>
         </w:rPr>
-        <w:t xml:space="preserve">Effort: </w:t>
+        <w:t xml:space="preserve">Time: </w:t>
       </w:r>
       <w:r>
         <w:rPr>
           <w:i/>
           <w:color w:val="1A7F4B"/>
         </w:rPr>
-        <w:t>~15 min per subscriber.</w:t>
+        <w:t>~10 minutes.</w:t>
       </w:r>
     </w:p>
     <w:p>
       <w:pPr>
         <w:pStyle w:val="ListBullet"/>
+        <w:spacing w:after="60"/>
+      </w:pPr>
+      <w:r>
+        <w:rPr>
+          <w:b/>
+          <w:color w:val="1F4E79"/>
+        </w:rPr>
+        <w:t xml:space="preserve">Issue: </w:t>
+      </w:r>
+      <w:r>
+        <w:t>A successful build does not prove the module works — the crashes above only appear at runtime.</w:t>
+      </w:r>
+    </w:p>
+    <w:p>
+      <w:pPr>
+        <w:pStyle w:val="ListBullet2"/>
+        <w:spacing w:after="60"/>
+      </w:pPr>
+      <w:r>
+        <w:rPr>
+          <w:b/>
+        </w:rPr>
+        <w:t xml:space="preserve">Solution: </w:t>
+      </w:r>
+      <w:r>
+        <w:rPr>
+          <w:i w:val="0"/>
+        </w:rPr>
+        <w:t>Build it, deploy it into the host, start the host, and confirm the module loads and one real data flow is correct.</w:t>
+      </w:r>
+    </w:p>
+    <w:p>
+      <w:pPr>
+        <w:pStyle w:val="ListBullet2"/>
+        <w:spacing w:after="60"/>
+      </w:pPr>
+      <w:r>
+        <w:rPr>
+          <w:b/>
+        </w:rPr>
+        <w:t xml:space="preserve">What the developer does: </w:t>
+      </w:r>
+      <w:r>
+        <w:rPr>
+          <w:i w:val="0"/>
+        </w:rPr>
+        <w:t>Build the subscriber, check its files land in the host’s Modules folder, run the host and watch it load the subscriber, then run one pull-map-save and compare the saved values to the old system (especially renamed fields).</w:t>
+      </w:r>
+    </w:p>
+    <w:p>
+      <w:pPr>
+        <w:pStyle w:val="ListBullet2"/>
         <w:spacing w:after="120"/>
       </w:pPr>
       <w:r>
         <w:rPr>
           <w:b/>
-        </w:rPr>
-        <w:t>Check one real data flow.</w:t>
-      </w:r>
-      <w:r>
-        <w:t xml:space="preserve"> Run one pull-map-save and confirm the saved values match the old system, especially any renamed fields.</w:t>
-      </w:r>
-      <w:r>
-        <w:t xml:space="preserve">  </w:t>
-      </w:r>
-      <w:r>
-        <w:rPr>
-          <w:b/>
           <w:color w:val="1A7F4B"/>
         </w:rPr>
-        <w:t xml:space="preserve">Effort: </w:t>
+        <w:t xml:space="preserve">Time: </w:t>
       </w:r>
       <w:r>
         <w:rPr>
           <w:i/>
           <w:color w:val="1A7F4B"/>
         </w:rPr>
-        <w:t>15-30 min per subscriber (needs the dev database).</w:t>
+        <w:t>~30–45 minutes (needs the dev database).</w:t>
       </w:r>
     </w:p>
     <w:p>
       <w:pPr>
-        <w:spacing w:after="200"/>
+        <w:spacing w:after="240"/>
       </w:pPr>
       <w:r>
         <w:rPr>
@@ -395,7 +631,7 @@
           <w:i w:val="0"/>
           <w:sz w:val="22"/>
         </w:rPr>
-        <w:t>Rough total per subscriber after the first: about 2-4 hours. First subscriber: about 1 day.</w:t>
+        <w:t>Rough total per subscriber after the first: about 2–4 hours. First subscriber: about 1 day.</w:t>
       </w:r>
     </w:p>
     <w:p>
@@ -416,143 +652,304 @@
       <w:r>
         <w:rPr>
           <w:b w:val="0"/>
-          <w:i w:val="0"/>
+          <w:i/>
+          <w:color w:val="555566"/>
           <w:sz w:val="22"/>
         </w:rPr>
-        <w:t>Filters are lighter. They normally have no mapping library, which removes the biggest and riskiest task.</w:t>
+        <w:t>Filters are lighter and normally do no data mapping, which removes the biggest and riskiest task.</w:t>
       </w:r>
     </w:p>
     <w:p>
       <w:pPr>
         <w:pStyle w:val="ListBullet"/>
-        <w:spacing w:after="120"/>
+        <w:spacing w:after="60"/>
+      </w:pPr>
+      <w:r>
+        <w:rPr>
+          <w:b/>
+          <w:color w:val="1F4E79"/>
+        </w:rPr>
+        <w:t xml:space="preserve">Issue: </w:t>
+      </w:r>
+      <w:r>
+        <w:t>The filter targets .NET 6 and must run on .NET 10.</w:t>
+      </w:r>
+    </w:p>
+    <w:p>
+      <w:pPr>
+        <w:pStyle w:val="ListBullet2"/>
+        <w:spacing w:after="60"/>
       </w:pPr>
       <w:r>
         <w:rPr>
           <w:b/>
         </w:rPr>
-        <w:t>Retarget to .NET 10 and match the host package versions.</w:t>
+        <w:t xml:space="preserve">Solution: </w:t>
       </w:r>
       <w:r>
-        <w:t xml:space="preserve"> Same scripted step as for subscribers.</w:t>
+        <w:rPr>
+          <w:i w:val="0"/>
+        </w:rPr>
+        <w:t>Retarget the project to .NET 10.</w:t>
+      </w:r>
+    </w:p>
+    <w:p>
+      <w:pPr>
+        <w:pStyle w:val="ListBullet2"/>
+        <w:spacing w:after="60"/>
+      </w:pPr>
+      <w:r>
+        <w:rPr>
+          <w:b/>
+        </w:rPr>
+        <w:t xml:space="preserve">What the developer does: </w:t>
       </w:r>
       <w:r>
-        <w:t xml:space="preserve">  </w:t>
+        <w:rPr>
+          <w:i w:val="0"/>
+        </w:rPr>
+        <w:t>Change the target framework from net6.0 to net10.0 in the project file.</w:t>
       </w:r>
+    </w:p>
+    <w:p>
+      <w:pPr>
+        <w:pStyle w:val="ListBullet2"/>
+        <w:spacing w:after="160"/>
+      </w:pPr>
       <w:r>
         <w:rPr>
           <w:b/>
           <w:color w:val="1A7F4B"/>
         </w:rPr>
-        <w:t xml:space="preserve">Effort: </w:t>
+        <w:t xml:space="preserve">Time: </w:t>
       </w:r>
       <w:r>
         <w:rPr>
           <w:i/>
           <w:color w:val="1A7F4B"/>
         </w:rPr>
-        <w:t>~5 min to run + ~10 min to review.</w:t>
+        <w:t>~5 minutes.</w:t>
       </w:r>
     </w:p>
     <w:p>
       <w:pPr>
         <w:pStyle w:val="ListBullet"/>
-        <w:spacing w:after="120"/>
+        <w:spacing w:after="60"/>
+      </w:pPr>
+      <w:r>
+        <w:rPr>
+          <w:b/>
+          <w:color w:val="1F4E79"/>
+        </w:rPr>
+        <w:t xml:space="preserve">Issue: </w:t>
+      </w:r>
+      <w:r>
+        <w:t>The filter’s shared library versions must match the host exactly, or it loads and then crashes.</w:t>
+      </w:r>
+    </w:p>
+    <w:p>
+      <w:pPr>
+        <w:pStyle w:val="ListBullet2"/>
+        <w:spacing w:after="60"/>
       </w:pPr>
       <w:r>
         <w:rPr>
           <w:b/>
         </w:rPr>
-        <w:t>Fix the hard-coded host DLL paths.</w:t>
+        <w:t xml:space="preserve">Solution: </w:t>
       </w:r>
       <w:r>
-        <w:t xml:space="preserve"> Same as above.</w:t>
+        <w:rPr>
+          <w:i w:val="0"/>
+        </w:rPr>
+        <w:t>Set every shared package to the host’s new versions.</w:t>
+      </w:r>
+    </w:p>
+    <w:p>
+      <w:pPr>
+        <w:pStyle w:val="ListBullet2"/>
+        <w:spacing w:after="60"/>
+      </w:pPr>
+      <w:r>
+        <w:rPr>
+          <w:b/>
+        </w:rPr>
+        <w:t xml:space="preserve">What the developer does: </w:t>
       </w:r>
       <w:r>
-        <w:t xml:space="preserve">  </w:t>
+        <w:rPr>
+          <w:i w:val="0"/>
+        </w:rPr>
+        <w:t>Note the host’s package versions and update the filter’s PackageReferences to match.</w:t>
       </w:r>
+    </w:p>
+    <w:p>
+      <w:pPr>
+        <w:pStyle w:val="ListBullet2"/>
+        <w:spacing w:after="160"/>
+      </w:pPr>
       <w:r>
         <w:rPr>
           <w:b/>
           <w:color w:val="1A7F4B"/>
         </w:rPr>
-        <w:t xml:space="preserve">Effort: </w:t>
+        <w:t xml:space="preserve">Time: </w:t>
       </w:r>
       <w:r>
         <w:rPr>
           <w:i/>
           <w:color w:val="1A7F4B"/>
         </w:rPr>
-        <w:t>Included (scripted).</w:t>
+        <w:t>~15 minutes.</w:t>
       </w:r>
     </w:p>
     <w:p>
       <w:pPr>
         <w:pStyle w:val="ListBullet"/>
-        <w:spacing w:after="120"/>
+        <w:spacing w:after="60"/>
+      </w:pPr>
+      <w:r>
+        <w:rPr>
+          <w:b/>
+          <w:color w:val="1F4E79"/>
+        </w:rPr>
+        <w:t xml:space="preserve">Issue: </w:t>
+      </w:r>
+      <w:r>
+        <w:t>The host-DLL reference paths have the framework folder baked in and would point at the old .NET 6 build after retargeting.</w:t>
+      </w:r>
+    </w:p>
+    <w:p>
+      <w:pPr>
+        <w:pStyle w:val="ListBullet2"/>
+        <w:spacing w:after="60"/>
       </w:pPr>
       <w:r>
         <w:rPr>
           <w:b/>
         </w:rPr>
-        <w:t>Build, deploy into the host, and confirm it loads.</w:t>
+        <w:t xml:space="preserve">Solution: </w:t>
       </w:r>
       <w:r>
-        <w:t xml:space="preserve"> Green build, then see it load in the running host.</w:t>
+        <w:rPr>
+          <w:i w:val="0"/>
+        </w:rPr>
+        <w:t>Make the reference paths framework-neutral.</w:t>
+      </w:r>
+    </w:p>
+    <w:p>
+      <w:pPr>
+        <w:pStyle w:val="ListBullet2"/>
+        <w:spacing w:after="60"/>
+      </w:pPr>
+      <w:r>
+        <w:rPr>
+          <w:b/>
+        </w:rPr>
+        <w:t xml:space="preserve">What the developer does: </w:t>
       </w:r>
       <w:r>
-        <w:t xml:space="preserve">  </w:t>
+        <w:rPr>
+          <w:i w:val="0"/>
+        </w:rPr>
+        <w:t>Replace "net6.0" in each host-DLL reference path with the build variables $(Configuration)\$(TargetFramework).</w:t>
       </w:r>
+    </w:p>
+    <w:p>
+      <w:pPr>
+        <w:pStyle w:val="ListBullet2"/>
+        <w:spacing w:after="160"/>
+      </w:pPr>
       <w:r>
         <w:rPr>
           <w:b/>
           <w:color w:val="1A7F4B"/>
         </w:rPr>
-        <w:t xml:space="preserve">Effort: </w:t>
+        <w:t xml:space="preserve">Time: </w:t>
       </w:r>
       <w:r>
         <w:rPr>
           <w:i/>
           <w:color w:val="1A7F4B"/>
         </w:rPr>
-        <w:t>~15 min per filter.</w:t>
+        <w:t>~10 minutes.</w:t>
       </w:r>
     </w:p>
     <w:p>
       <w:pPr>
         <w:pStyle w:val="ListBullet"/>
+        <w:spacing w:after="60"/>
+      </w:pPr>
+      <w:r>
+        <w:rPr>
+          <w:b/>
+          <w:color w:val="1F4E79"/>
+        </w:rPr>
+        <w:t xml:space="preserve">Issue: </w:t>
+      </w:r>
+      <w:r>
+        <w:t>A green build is not proof the filter loads and behaves correctly on .NET 10.</w:t>
+      </w:r>
+    </w:p>
+    <w:p>
+      <w:pPr>
+        <w:pStyle w:val="ListBullet2"/>
+        <w:spacing w:after="60"/>
+      </w:pPr>
+      <w:r>
+        <w:rPr>
+          <w:b/>
+        </w:rPr>
+        <w:t xml:space="preserve">Solution: </w:t>
+      </w:r>
+      <w:r>
+        <w:rPr>
+          <w:i w:val="0"/>
+        </w:rPr>
+        <w:t>Build, deploy into the host, start it, and check the filter loads and works as before.</w:t>
+      </w:r>
+    </w:p>
+    <w:p>
+      <w:pPr>
+        <w:pStyle w:val="ListBullet2"/>
+        <w:spacing w:after="60"/>
+      </w:pPr>
+      <w:r>
+        <w:rPr>
+          <w:b/>
+        </w:rPr>
+        <w:t xml:space="preserve">What the developer does: </w:t>
+      </w:r>
+      <w:r>
+        <w:rPr>
+          <w:i w:val="0"/>
+        </w:rPr>
+        <w:t>Build the filter, confirm it deploys into the host’s Modules folder, run the host and confirm the filter loads and behaves the same as before.</w:t>
+      </w:r>
+    </w:p>
+    <w:p>
+      <w:pPr>
+        <w:pStyle w:val="ListBullet2"/>
         <w:spacing w:after="120"/>
       </w:pPr>
       <w:r>
         <w:rPr>
           <w:b/>
-        </w:rPr>
-        <w:t>Quick functional check.</w:t>
-      </w:r>
-      <w:r>
-        <w:t xml:space="preserve"> Run the filter once and confirm it behaves as before.</w:t>
-      </w:r>
-      <w:r>
-        <w:t xml:space="preserve">  </w:t>
-      </w:r>
-      <w:r>
-        <w:rPr>
-          <w:b/>
           <w:color w:val="1A7F4B"/>
         </w:rPr>
-        <w:t xml:space="preserve">Effort: </w:t>
+        <w:t xml:space="preserve">Time: </w:t>
       </w:r>
       <w:r>
         <w:rPr>
           <w:i/>
           <w:color w:val="1A7F4B"/>
         </w:rPr>
-        <w:t>~15 min (needs the dev database if the filter touches data).</w:t>
+        <w:t>~20–30 minutes (needs the dev database if it touches data).</w:t>
       </w:r>
     </w:p>
     <w:p>
       <w:pPr>
-        <w:spacing w:after="80"/>
+        <w:spacing w:after="40"/>
       </w:pPr>
       <w:r>
         <w:rPr>
@@ -560,12 +957,12 @@
           <w:i w:val="0"/>
           <w:sz w:val="22"/>
         </w:rPr>
-        <w:t>Rough total per filter: about 30-45 minutes. No AutoMapper means no mapping rewrite and no clone trap.</w:t>
+        <w:t>Rough total per filter: about 30–45 minutes. No data mapping means no AutoMapper rewrite and no clone trap.</w:t>
       </w:r>
     </w:p>
     <w:p>
       <w:pPr>
-        <w:spacing w:after="200"/>
+        <w:spacing w:after="240"/>
       </w:pPr>
       <w:r>
         <w:rPr>
@@ -573,7 +970,7 @@
           <w:i w:val="0"/>
           <w:sz w:val="22"/>
         </w:rPr>
-        <w:t>One caveat: if a filter DOES use AutoMapper (check the inventory list the script produces), treat that part exactly like a subscriber — add the 0.5-2 hours for the mapping rewrite.</w:t>
+        <w:t>One caveat: if a filter does use AutoMapper, treat that part exactly like a subscriber and add the 0.5–2 hours for the mapping rewrite.</w:t>
       </w:r>
     </w:p>
     <w:p>
@@ -590,31 +987,29 @@
     <w:p>
       <w:pPr>
         <w:pStyle w:val="ListBullet"/>
-        <w:spacing w:after="120"/>
       </w:pPr>
       <w:r>
         <w:rPr>
           <w:b/>
         </w:rPr>
-        <w:t>Ship together.</w:t>
+        <w:t xml:space="preserve">Ship together. </w:t>
       </w:r>
       <w:r>
-        <w:t xml:space="preserve"> All migrated modules deploy with the host in one restart window. Do not let any module lag — that is the one thing that breaks the whole service.</w:t>
+        <w:t>All migrated modules deploy with the host in one restart window. Letting any module lag is the one thing that breaks the whole service.</w:t>
       </w:r>
     </w:p>
     <w:p>
       <w:pPr>
         <w:pStyle w:val="ListBullet"/>
-        <w:spacing w:after="120"/>
       </w:pPr>
       <w:r>
         <w:rPr>
           <w:b/>
         </w:rPr>
-        <w:t>Fix old breakage first.</w:t>
+        <w:t xml:space="preserve">Fix old breakage first. </w:t>
       </w:r>
       <w:r>
-        <w:t xml:space="preserve"> If a module did not even build against the current host before you started (this happened on the sample estate), fix that as a separate change first — otherwise you will be chasing errors that were already there and blaming the upgrade.</w:t>
+        <w:t>If a module did not even build against the current host before the upgrade started, fix that as a separate change first — otherwise you will chase errors that were already there and blame the upgrade.</w:t>
       </w:r>
     </w:p>
     <w:p>
@@ -636,9 +1031,10 @@
         <w:rPr>
           <w:b w:val="0"/>
           <w:i/>
+          <w:color w:val="555566"/>
           <w:sz w:val="22"/>
         </w:rPr>
-        <w:t>None of these are needed to finish the upgrade. They pay off later.</w:t>
+        <w:t>Not needed to finish the upgrade. These pay off later.</w:t>
       </w:r>
     </w:p>
     <w:p>
@@ -650,10 +1046,10 @@
         <w:rPr>
           <w:b/>
         </w:rPr>
-        <w:t>Delete the dead mapping plumbing.</w:t>
+        <w:t xml:space="preserve">Delete the dead mapping code. </w:t>
       </w:r>
       <w:r>
-        <w:t xml:space="preserve"> Remove the old mapper-factory interfaces and any unused maps left behind.</w:t>
+        <w:t>Remove the old mapper-factory files and any unused maps left behind.</w:t>
       </w:r>
       <w:r>
         <w:t xml:space="preserve">  </w:t>
@@ -663,7 +1059,7 @@
           <w:b/>
           <w:color w:val="1A7F4B"/>
         </w:rPr>
-        <w:t xml:space="preserve">Effort: </w:t>
+        <w:t xml:space="preserve">Time: </w:t>
       </w:r>
       <w:r>
         <w:rPr>
@@ -682,10 +1078,10 @@
         <w:rPr>
           <w:b/>
         </w:rPr>
-        <w:t>Add a small parity test per subscriber.</w:t>
+        <w:t xml:space="preserve">Add a small parity test per subscriber. </w:t>
       </w:r>
       <w:r>
-        <w:t xml:space="preserve"> Map an object the old way and the new way and compare — so future edits to the mapping stay safe.</w:t>
+        <w:t>Map an object the old way and the new way and compare, so future edits stay safe.</w:t>
       </w:r>
       <w:r>
         <w:t xml:space="preserve">  </w:t>
@@ -695,14 +1091,14 @@
           <w:b/>
           <w:color w:val="1A7F4B"/>
         </w:rPr>
-        <w:t xml:space="preserve">Effort: </w:t>
+        <w:t xml:space="preserve">Time: </w:t>
       </w:r>
       <w:r>
         <w:rPr>
           <w:i/>
           <w:color w:val="1A7F4B"/>
         </w:rPr>
-        <w:t>~1-2 hours to build once, then reusable.</w:t>
+        <w:t>~1–2 hours once, then reusable.</w:t>
       </w:r>
     </w:p>
     <w:p>
@@ -714,10 +1110,10 @@
         <w:rPr>
           <w:b/>
         </w:rPr>
-        <w:t>Centralise package versions.</w:t>
+        <w:t xml:space="preserve">Centralise package versions. </w:t>
       </w:r>
       <w:r>
-        <w:t xml:space="preserve"> Put all shared versions in one file (central package management) so host and modules can never drift apart again — kills a whole class of future bugs.</w:t>
+        <w:t>Put all shared versions in one central file so host and modules can never drift apart again.</w:t>
       </w:r>
       <w:r>
         <w:t xml:space="preserve">  </w:t>
@@ -727,7 +1123,7 @@
           <w:b/>
           <w:color w:val="1A7F4B"/>
         </w:rPr>
-        <w:t xml:space="preserve">Effort: </w:t>
+        <w:t xml:space="preserve">Time: </w:t>
       </w:r>
       <w:r>
         <w:rPr>
@@ -746,10 +1142,10 @@
         <w:rPr>
           <w:b/>
         </w:rPr>
-        <w:t>Add a startup self-check.</w:t>
+        <w:t xml:space="preserve">Add a startup self-check. </w:t>
       </w:r>
       <w:r>
-        <w:t xml:space="preserve"> Have the host log every module it loaded and fail fast if one is missing or incompatible, instead of dying mid-request.</w:t>
+        <w:t>Have the host log every module it loaded and fail fast if one is missing or incompatible, instead of dying mid-request.</w:t>
       </w:r>
       <w:r>
         <w:t xml:space="preserve">  </w:t>
@@ -759,7 +1155,7 @@
           <w:b/>
           <w:color w:val="1A7F4B"/>
         </w:rPr>
-        <w:t xml:space="preserve">Effort: </w:t>
+        <w:t xml:space="preserve">Time: </w:t>
       </w:r>
       <w:r>
         <w:rPr>
@@ -778,10 +1174,10 @@
         <w:rPr>
           <w:b/>
         </w:rPr>
-        <w:t>Automate the "does it load" smoke test in CI.</w:t>
+        <w:t xml:space="preserve">Automate the "does it load" check. </w:t>
       </w:r>
       <w:r>
-        <w:t xml:space="preserve"> Turn the manual load check into an automated test so a bad module is caught before deployment.</w:t>
+        <w:t>Turn the manual load check into an automated test so a bad module is caught before deployment.</w:t>
       </w:r>
       <w:r>
         <w:t xml:space="preserve">  </w:t>
@@ -791,7 +1187,7 @@
           <w:b/>
           <w:color w:val="1A7F4B"/>
         </w:rPr>
-        <w:t xml:space="preserve">Effort: </w:t>
+        <w:t xml:space="preserve">Time: </w:t>
       </w:r>
       <w:r>
         <w:rPr>
@@ -810,10 +1206,10 @@
         <w:rPr>
           <w:b/>
         </w:rPr>
-        <w:t>Standardise on the generated mapper everywhere.</w:t>
+        <w:t xml:space="preserve">Turn on nullable reference types and a newer C# version. </w:t>
       </w:r>
       <w:r>
-        <w:t xml:space="preserve"> Remove any remaining runtime-configured mapping patterns across the code base for consistency.</w:t>
+        <w:t>Extra compile-time safety while every project is being touched anyway.</w:t>
       </w:r>
       <w:r>
         <w:t xml:space="preserve">  </w:t>
@@ -823,46 +1219,14 @@
           <w:b/>
           <w:color w:val="1A7F4B"/>
         </w:rPr>
-        <w:t xml:space="preserve">Effort: </w:t>
+        <w:t xml:space="preserve">Time: </w:t>
       </w:r>
       <w:r>
         <w:rPr>
           <w:i/>
           <w:color w:val="1A7F4B"/>
         </w:rPr>
-        <w:t>Ongoing / opportunistic.</w:t>
-      </w:r>
-    </w:p>
-    <w:p>
-      <w:pPr>
-        <w:pStyle w:val="ListBullet"/>
-        <w:spacing w:after="120"/>
-      </w:pPr>
-      <w:r>
-        <w:rPr>
-          <w:b/>
-        </w:rPr>
-        <w:t>Turn on nullable reference types and a newer C# language version on modules.</w:t>
-      </w:r>
-      <w:r>
-        <w:t xml:space="preserve"> Extra compile-time safety while you are already touching every project.</w:t>
-      </w:r>
-      <w:r>
-        <w:t xml:space="preserve">  </w:t>
-      </w:r>
-      <w:r>
-        <w:rPr>
-          <w:b/>
-          <w:color w:val="1A7F4B"/>
-        </w:rPr>
-        <w:t xml:space="preserve">Effort: </w:t>
-      </w:r>
-      <w:r>
-        <w:rPr>
-          <w:i/>
-          <w:color w:val="1A7F4B"/>
-        </w:rPr>
-        <w:t>Small per module, adds up.</w:t>
+        <w:t>Small per module.</w:t>
       </w:r>
     </w:p>
     <w:p/>
@@ -877,7 +1241,7 @@
           <w:color w:val="777788"/>
           <w:sz w:val="18"/>
         </w:rPr>
-        <w:t>Prepared as a plain-language companion to the module upgrade runbook and effort report.</w:t>
+        <w:t>Plain-language companion to the module upgrade runbook and effort report.</w:t>
       </w:r>
     </w:p>
     <w:sectPr>

</xml_diff>